<commit_message>
Refina texto da proposta CasaMarelo
Remove intro redundante, suaviza "leve e rapido" para "mais rapido
que hoje, sem travamento" e adiciona ressalva de custo do escopo
trilingue.

Co-Authored-By: Claude Sonnet 5 <noreply@anthropic.com>
</commit_message>
<xml_diff>
--- a/docs/proposta-casamarelo.docx
+++ b/docs/proposta-casamarelo.docx
@@ -94,16 +94,6 @@
     </w:p>
     <w:p>
       <w:pPr>
-        <w:rPr>
-          <w:rFonts w:hint="eastAsia"/>
-        </w:rPr>
-      </w:pPr>
-      <w:r>
-        <w:t>Fomos ao casamarelo.com e clicamos em cada botão, cada link, cada seção do menu. O que segue é o que encontramos — e o que entregamos no lugar.</w:t>
-      </w:r>
-    </w:p>
-    <w:p>
-      <w:pPr>
         <w:spacing w:before="320" w:after="120"/>
         <w:rPr>
           <w:rFonts w:hint="eastAsia"/>
@@ -115,7 +105,7 @@
           <w:color w:val="B85C2E"/>
           <w:sz w:val="24"/>
         </w:rPr>
-        <w:t>O que o site atual promete e não entrega</w:t>
+        <w:t>O que não está funcional do site atual</w:t>
       </w:r>
     </w:p>
     <w:p>
@@ -243,7 +233,7 @@
         <w:t>três idiomas</w:t>
       </w:r>
       <w:r>
-        <w:t>: português, inglês e espanhol.</w:t>
+        <w:t>: português, inglês e espanhol — pode haver um pequeno custo de ferramenta à parte, a confirmar no diagnóstico.</w:t>
       </w:r>
     </w:p>
     <w:p>
@@ -350,10 +340,10 @@
           <w:b/>
           <w:color w:val="B85C2E"/>
         </w:rPr>
-        <w:t>leve e rápido</w:t>
+        <w:t>mais rápido que hoje</w:t>
       </w:r>
       <w:r>
-        <w:t>, pensado primeiro para celular.</w:t>
+        <w:t>, sem o travamento ao rolar a página.</w:t>
       </w:r>
     </w:p>
     <w:p>
@@ -458,32 +448,6 @@
         <w:t>Produção de fotos ou vídeos profissionais.</w:t>
       </w:r>
     </w:p>
-    <w:p>
-      <w:pPr>
-        <w:spacing w:before="320" w:after="120"/>
-        <w:rPr>
-          <w:rFonts w:hint="eastAsia"/>
-        </w:rPr>
-      </w:pPr>
-      <w:r>
-        <w:rPr>
-          <w:b/>
-          <w:color w:val="B85C2E"/>
-          <w:sz w:val="24"/>
-        </w:rPr>
-        <w:t>Próximo passo</w:t>
-      </w:r>
-    </w:p>
-    <w:p>
-      <w:pPr>
-        <w:rPr>
-          <w:rFonts w:hint="eastAsia"/>
-        </w:rPr>
-      </w:pPr>
-      <w:r>
-        <w:t>O combinado completo — noites de hospedagem, prazos e forma de entrega — vem no contrato, a seguir.</w:t>
-      </w:r>
-    </w:p>
     <w:sectPr>
       <w:headerReference w:type="default" r:id="rId8"/>
       <w:footerReference w:type="default" r:id="rId9"/>
@@ -547,10 +511,10 @@
         <w:noProof/>
       </w:rPr>
       <w:drawing>
-        <wp:inline distT="0" distB="0" distL="0" distR="0" wp14:anchorId="14C18ECF" wp14:editId="609060A8">
+        <wp:inline distT="0" distB="0" distL="0" distR="0" wp14:anchorId="47D8E949" wp14:editId="677A5F06">
           <wp:extent cx="307636" cy="216000"/>
           <wp:effectExtent l="0" t="0" r="0" b="0"/>
-          <wp:docPr id="1269910288" name="Picture 1"/>
+          <wp:docPr id="506327279" name="Picture 1"/>
           <wp:cNvGraphicFramePr>
             <a:graphicFrameLocks xmlns:a="http://schemas.openxmlformats.org/drawingml/2006/main" noChangeAspect="1"/>
           </wp:cNvGraphicFramePr>
@@ -697,7 +661,7 @@
         <w:noProof/>
       </w:rPr>
       <w:drawing>
-        <wp:inline distT="0" distB="0" distL="0" distR="0" wp14:anchorId="119496EE" wp14:editId="0C6EE12F">
+        <wp:inline distT="0" distB="0" distL="0" distR="0" wp14:anchorId="6A6AA987" wp14:editId="18F69C5A">
           <wp:extent cx="2078216" cy="324000"/>
           <wp:effectExtent l="0" t="0" r="0" b="0"/>
           <wp:docPr id="1" name="Picture 1"/>
@@ -918,31 +882,31 @@
       </w:rPr>
     </w:lvl>
   </w:abstractNum>
-  <w:num w:numId="1" w16cid:durableId="1306396293">
+  <w:num w:numId="1" w16cid:durableId="2125809355">
     <w:abstractNumId w:val="8"/>
   </w:num>
-  <w:num w:numId="2" w16cid:durableId="450781247">
+  <w:num w:numId="2" w16cid:durableId="1409502798">
     <w:abstractNumId w:val="6"/>
   </w:num>
-  <w:num w:numId="3" w16cid:durableId="1582105725">
+  <w:num w:numId="3" w16cid:durableId="112140296">
     <w:abstractNumId w:val="5"/>
   </w:num>
-  <w:num w:numId="4" w16cid:durableId="1259682042">
+  <w:num w:numId="4" w16cid:durableId="1466704280">
     <w:abstractNumId w:val="4"/>
   </w:num>
-  <w:num w:numId="5" w16cid:durableId="757216986">
+  <w:num w:numId="5" w16cid:durableId="1425684684">
     <w:abstractNumId w:val="7"/>
   </w:num>
-  <w:num w:numId="6" w16cid:durableId="658309445">
+  <w:num w:numId="6" w16cid:durableId="1791625401">
     <w:abstractNumId w:val="3"/>
   </w:num>
-  <w:num w:numId="7" w16cid:durableId="1412383622">
+  <w:num w:numId="7" w16cid:durableId="580140821">
     <w:abstractNumId w:val="2"/>
   </w:num>
-  <w:num w:numId="8" w16cid:durableId="2122187828">
+  <w:num w:numId="8" w16cid:durableId="676615130">
     <w:abstractNumId w:val="1"/>
   </w:num>
-  <w:num w:numId="9" w16cid:durableId="973560593">
+  <w:num w:numId="9" w16cid:durableId="949899231">
     <w:abstractNumId w:val="0"/>
   </w:num>
 </w:numbering>

</xml_diff>